<commit_message>
Fuel price update 2026-08-28 — Trentino-Alto Adige spotlight
</commit_message>
<xml_diff>
--- a/slides/article-2026-08-28.docx
+++ b/slides/article-2026-08-28.docx
@@ -28,7 +28,7 @@
           <w:sz w:val="56"/>
           <w:szCs w:val="56"/>
         </w:rPr>
-        <w:t xml:space="preserve">In Trentino-Alto Adige, Diesel Pushes Past €2.20 as the Alpine Region Runs Ahead of the Nation</w:t>
+        <w:t xml:space="preserve">Trentino-Alto Adige's Diesel Hits €2.20 as Alpine Prices Pull Away From the National Average</w:t>
       </w:r>
     </w:p>
     <w:p>
@@ -44,7 +44,7 @@
           <w:sz w:val="24"/>
           <w:szCs w:val="24"/>
         </w:rPr>
-        <w:t xml:space="preserve">A week-long climb in self-service Benzina and Gasolio has left Italy's northernmost region running several cents above the national average.</w:t>
+        <w:t xml:space="preserve">Seven straight days of gains have pushed self-service Benzina and Gasolio in Italy's northernmost region well above what drivers pay nationwide.</w:t>
       </w:r>
     </w:p>
     <w:tbl>
@@ -304,7 +304,7 @@
           <w:sz w:val="22"/>
           <w:szCs w:val="22"/>
         </w:rPr>
-        <w:t xml:space="preserve">Drivers filling up in Trentino-Alto Adige are paying more than most of the country this week. Self-service Benzina averaged €2.0763 per liter on August 27, versus Italy's national self-service average of €2.0285 — a gap of nearly 4.8 cents. Gasolio told a similar story, at €2.2030 locally against €2.1637 nationally, about 3.9 cents higher. For an Alpine region with heavy tourist traffic and higher fuel-logistics costs, running above the national curve isn't unusual, but this week's premium sits on the wider end of normal.</w:t>
+        <w:t xml:space="preserve">Drivers filling up in Trentino-Alto Adige are paying €2.076 per litre for self-service Benzina and €2.203 for Gasolio as of August 27 — both noticeably above the national self-service averages of €2.029 and €2.164. That's roughly 4.8 cents more per litre for petrol and 3.9 cents more for diesel than the rest of the country, a gap of about 2% and 1.8% respectively that has held steady through the region's recent price run-up.</w:t>
       </w:r>
     </w:p>
     <w:p>
@@ -318,7 +318,7 @@
           <w:sz w:val="22"/>
           <w:szCs w:val="22"/>
         </w:rPr>
-        <w:t xml:space="preserve">The climb hasn't been sudden — it's been steady. Over the ten days from August 17 to August 27, self-service Benzina in the region rose from €2.0508 to €2.0763, up about 1.2%, while Gasolio climbed more sharply, from €2.1621 to €2.2030, up nearly 1.9%. Behind those numbers, the region's fuel network stayed active: 392 stations are registered in Trentino-Alto Adige, and 372 of them — roughly 95% — reported prices on the latest collection day, a solid reporting rate that points to genuine market movement rather than gaps in the data.</w:t>
+        <w:t xml:space="preserve">The climb hasn't been a one-day blip: both fuels have risen on every one of the last seven tracked days, with Benzina self-service creeping up from €2.054 to €2.076 and Gasolio from €2.169 to €2.203 over that stretch. Meanwhile the region's station network stayed essentially unchanged — 392 registered pumps with 372 actively reporting prices — so the increase reflects genuine cost pressure rather than any shift in who's supplying the market.</w:t>
       </w:r>
     </w:p>
     <w:p>
@@ -332,7 +332,7 @@
           <w:sz w:val="22"/>
           <w:szCs w:val="22"/>
         </w:rPr>
-        <w:t xml:space="preserve">Numbers like these — one region, one week, one specific climb — are only worth publishing if they're fresh every single day. That's the point of Fuel Dashboard: it pulls Italy's official MIMIT price feeds, recalculates every region's figures, and rotates through a new regional spotlight automatically, with no manual spreadsheet upkeep. The dashboard was built with Claude Code, and this article is generated the same way — a small proof that AI-assisted tooling can turn a one-off dashboard into something that keeps itself current, day after day.</w:t>
+        <w:t xml:space="preserve">Catching a seven-day uptrend in a single region, on the day it happens, isn't something a manually updated spreadsheet can keep up with. Fuel Dashboard pulls the official MIMIT feed, recomputes national and regional figures, and rotates through a new Italian region every day automatically — the whole pipeline runs itself, built with Claude Code, with no one manually copying numbers into a sheet each morning.</w:t>
       </w:r>
     </w:p>
     <w:p>
@@ -351,7 +351,7 @@
           <w:sz w:val="30"/>
           <w:szCs w:val="30"/>
         </w:rPr>
-        <w:t xml:space="preserve">Diesel in Trentino-Alto Adige has climbed nearly 1.9% in just ten days — and it's still running almost 4 cents above the national average.</w:t>
+        <w:t xml:space="preserve">Self-service diesel in Trentino-Alto Adige has now risen for seven straight tracked days, sitting almost 4 cents above the Italian national average.</w:t>
       </w:r>
     </w:p>
     <w:p>

</xml_diff>